<commit_message>
Module prompts: starter and follow-up prompts (.md), optional tools note, 9 pt minimum in the Word guides
Co-Authored-By: Claude Opus 5.5 <noreply@anthropic.com>
Claude-Session: https://claude.ai/code/session_01VSHkeJ4eFkKsk4vddYXphE
</commit_message>
<xml_diff>
--- a/excel_ai/plans/prompts/CPAT-AI_HowTo_Distribution.docx
+++ b/excel_ai/plans/prompts/CPAT-AI_HowTo_Distribution.docx
@@ -636,25 +636,23 @@
           <w:sz w:val="21"/>
           <w:szCs w:val="21"/>
         </w:rPr>
-        <w:t xml:space="preserve">Python 3 with openpyxl, and </w:t>
-      </w:r>
-      <w:r>
-        <w:rPr>
-          <w:rFonts w:ascii="Arial" w:cs="Arial" w:eastAsia="Arial" w:hAnsi="Arial"/>
-          <w:b/>
-          <w:bCs/>
-          <w:sz w:val="21"/>
-          <w:szCs w:val="21"/>
-        </w:rPr>
-        <w:t xml:space="preserve">LibreOffice</w:t>
-      </w:r>
-      <w:r>
-        <w:rPr>
-          <w:rFonts w:ascii="Arial" w:cs="Arial" w:eastAsia="Arial" w:hAnsi="Arial"/>
-          <w:sz w:val="21"/>
-          <w:szCs w:val="21"/>
-        </w:rPr>
-        <w:t xml:space="preserve"> installed (the builders and checks recalculate in it). Excel 365 for your own review.</w:t>
+        <w:t xml:space="preserve">The prompt file </w:t>
+      </w:r>
+      <w:r>
+        <w:rPr>
+          <w:rFonts w:ascii="Consolas" w:cs="Consolas" w:eastAsia="Consolas" w:hAnsi="Consolas"/>
+          <w:sz w:val="19"/>
+          <w:szCs w:val="19"/>
+        </w:rPr>
+        <w:t xml:space="preserve">excel_ai/plans/prompts/Distribution_module_prompt.md</w:t>
+      </w:r>
+      <w:r>
+        <w:rPr>
+          <w:rFonts w:ascii="Arial" w:cs="Arial" w:eastAsia="Arial" w:hAnsi="Arial"/>
+          <w:sz w:val="21"/>
+          <w:szCs w:val="21"/>
+        </w:rPr>
+        <w:t xml:space="preserve"> is in your checkout once the CPAT-AI branch that adds it is merged into main and you have synced; until then use Appendix A (the same text).</w:t>
       </w:r>
     </w:p>
     <w:p>
@@ -672,7 +670,7 @@
           <w:sz w:val="21"/>
           <w:szCs w:val="21"/>
         </w:rPr>
-        <w:t xml:space="preserve">The prompt file </w:t>
+        <w:t xml:space="preserve">Time and credits: each phase is a long task. Send one phase, read the report, then the next. Type </w:t>
       </w:r>
       <w:r>
         <w:rPr>
@@ -680,15 +678,15 @@
           <w:sz w:val="19"/>
           <w:szCs w:val="19"/>
         </w:rPr>
-        <w:t xml:space="preserve">excel_ai/plans/prompts/Distribution_module_prompt.md</w:t>
-      </w:r>
-      <w:r>
-        <w:rPr>
-          <w:rFonts w:ascii="Arial" w:cs="Arial" w:eastAsia="Arial" w:hAnsi="Arial"/>
-          <w:sz w:val="21"/>
-          <w:szCs w:val="21"/>
-        </w:rPr>
-        <w:t xml:space="preserve"> is in your checkout once the CPAT-AI branch that adds it is merged into main and you have synced; until then use Appendix A (the same text).</w:t>
+        <w:t xml:space="preserve">/context</w:t>
+      </w:r>
+      <w:r>
+        <w:rPr>
+          <w:rFonts w:ascii="Arial" w:cs="Arial" w:eastAsia="Arial" w:hAnsi="Arial"/>
+          <w:sz w:val="21"/>
+          <w:szCs w:val="21"/>
+        </w:rPr>
+        <w:t xml:space="preserve"> to see the credits used.</w:t>
       </w:r>
     </w:p>
     <w:p>
@@ -706,41 +704,30 @@
           <w:sz w:val="21"/>
           <w:szCs w:val="21"/>
         </w:rPr>
-        <w:t xml:space="preserve">Time and credits: each phase is a long task. Send one phase, read the report, then the next. Type </w:t>
-      </w:r>
-      <w:r>
-        <w:rPr>
-          <w:rFonts w:ascii="Consolas" w:cs="Consolas" w:eastAsia="Consolas" w:hAnsi="Consolas"/>
-          <w:sz w:val="19"/>
-          <w:szCs w:val="19"/>
-        </w:rPr>
-        <w:t xml:space="preserve">/context</w:t>
-      </w:r>
-      <w:r>
-        <w:rPr>
-          <w:rFonts w:ascii="Arial" w:cs="Arial" w:eastAsia="Arial" w:hAnsi="Arial"/>
-          <w:sz w:val="21"/>
-          <w:szCs w:val="21"/>
-        </w:rPr>
-        <w:t xml:space="preserve"> to see the credits used.</w:t>
-      </w:r>
-    </w:p>
-    <w:p>
-      <w:pPr>
-        <w:pStyle w:val="ListParagraph"/>
-        <w:numPr>
-          <w:ilvl w:val="0"/>
-          <w:numId w:val="3"/>
-        </w:numPr>
-        <w:spacing w:after="60"/>
-      </w:pPr>
-      <w:r>
-        <w:rPr>
-          <w:rFonts w:ascii="Arial" w:cs="Arial" w:eastAsia="Arial" w:hAnsi="Arial"/>
-          <w:sz w:val="21"/>
-          <w:szCs w:val="21"/>
-        </w:rPr>
         <w:t xml:space="preserve">Victor and Faustyna: you do not need Copilot to use the module (section 1b). The prompt is for changes to it.</w:t>
+      </w:r>
+    </w:p>
+    <w:p>
+      <w:pPr>
+        <w:spacing w:after="120"/>
+      </w:pPr>
+      <w:r>
+        <w:rPr>
+          <w:rFonts w:ascii="Arial" w:cs="Arial" w:eastAsia="Arial" w:hAnsi="Arial"/>
+          <w:b/>
+          <w:bCs/>
+          <w:sz w:val="21"/>
+          <w:szCs w:val="21"/>
+        </w:rPr>
+        <w:t xml:space="preserve">Optional</w:t>
+      </w:r>
+      <w:r>
+        <w:rPr>
+          <w:rFonts w:ascii="Arial" w:cs="Arial" w:eastAsia="Arial" w:hAnsi="Arial"/>
+          <w:sz w:val="21"/>
+          <w:szCs w:val="21"/>
+        </w:rPr>
+        <w:t xml:space="preserve"> (not needed to start): Copilot runs the builders and checks with Python and recalculates the workbooks in LibreOffice. If either is missing on your desktop, the prompt tells Copilot to say so, install nothing without your OK, and list what it could not run; you then review the workbook in Excel 365.</w:t>
       </w:r>
     </w:p>
     <w:p>
@@ -1343,6 +1330,69 @@
           <w:sz w:val="21"/>
           <w:szCs w:val="21"/>
         </w:rPr>
+        <w:t xml:space="preserve">You only type a short </w:t>
+      </w:r>
+      <w:r>
+        <w:rPr>
+          <w:rFonts w:ascii="Arial" w:cs="Arial" w:eastAsia="Arial" w:hAnsi="Arial"/>
+          <w:b/>
+          <w:bCs/>
+          <w:sz w:val="21"/>
+          <w:szCs w:val="21"/>
+        </w:rPr>
+        <w:t xml:space="preserve">starter prompt</w:t>
+      </w:r>
+      <w:r>
+        <w:rPr>
+          <w:rFonts w:ascii="Arial" w:cs="Arial" w:eastAsia="Arial" w:hAnsi="Arial"/>
+          <w:sz w:val="21"/>
+          <w:szCs w:val="21"/>
+        </w:rPr>
+        <w:t xml:space="preserve">. The long instructions are a file in the repo (</w:t>
+      </w:r>
+      <w:r>
+        <w:rPr>
+          <w:rFonts w:ascii="Consolas" w:cs="Consolas" w:eastAsia="Consolas" w:hAnsi="Consolas"/>
+          <w:sz w:val="19"/>
+          <w:szCs w:val="19"/>
+        </w:rPr>
+        <w:t xml:space="preserve">excel_ai/plans/prompts/Distribution_module_prompt.md</w:t>
+      </w:r>
+      <w:r>
+        <w:rPr>
+          <w:rFonts w:ascii="Arial" w:cs="Arial" w:eastAsia="Arial" w:hAnsi="Arial"/>
+          <w:sz w:val="21"/>
+          <w:szCs w:val="21"/>
+        </w:rPr>
+        <w:t xml:space="preserve">) that Copilot reads itself; the starter and the follow-up prompts are in </w:t>
+      </w:r>
+      <w:r>
+        <w:rPr>
+          <w:rFonts w:ascii="Consolas" w:cs="Consolas" w:eastAsia="Consolas" w:hAnsi="Consolas"/>
+          <w:sz w:val="19"/>
+          <w:szCs w:val="19"/>
+        </w:rPr>
+        <w:t xml:space="preserve">excel_ai/plans/prompts/Distribution_starter_prompts.md</w:t>
+      </w:r>
+      <w:r>
+        <w:rPr>
+          <w:rFonts w:ascii="Arial" w:cs="Arial" w:eastAsia="Arial" w:hAnsi="Arial"/>
+          <w:sz w:val="21"/>
+          <w:szCs w:val="21"/>
+        </w:rPr>
+        <w:t xml:space="preserve"> and in Appendix B.</w:t>
+      </w:r>
+    </w:p>
+    <w:p>
+      <w:pPr>
+        <w:spacing w:after="120"/>
+      </w:pPr>
+      <w:r>
+        <w:rPr>
+          <w:rFonts w:ascii="Arial" w:cs="Arial" w:eastAsia="Arial" w:hAnsi="Arial"/>
+          <w:sz w:val="21"/>
+          <w:szCs w:val="21"/>
+        </w:rPr>
         <w:t xml:space="preserve">Option A (the prompt file is in your checkout): type </w:t>
       </w:r>
       <w:r>
@@ -2077,6 +2127,37 @@
     </w:p>
     <w:p>
       <w:pPr>
+        <w:spacing w:after="120"/>
+      </w:pPr>
+      <w:r>
+        <w:rPr>
+          <w:rFonts w:ascii="Arial" w:cs="Arial" w:eastAsia="Arial" w:hAnsi="Arial"/>
+          <w:sz w:val="21"/>
+          <w:szCs w:val="21"/>
+        </w:rPr>
+        <w:t xml:space="preserve">More example follow-ups (answering its decisions, asking for an explanation, a failing check, stopping and resuming in a new session): </w:t>
+      </w:r>
+      <w:r>
+        <w:rPr>
+          <w:rFonts w:ascii="Arial" w:cs="Arial" w:eastAsia="Arial" w:hAnsi="Arial"/>
+          <w:b/>
+          <w:bCs/>
+          <w:sz w:val="21"/>
+          <w:szCs w:val="21"/>
+        </w:rPr>
+        <w:t xml:space="preserve">Appendix B</w:t>
+      </w:r>
+      <w:r>
+        <w:rPr>
+          <w:rFonts w:ascii="Arial" w:cs="Arial" w:eastAsia="Arial" w:hAnsi="Arial"/>
+          <w:sz w:val="21"/>
+          <w:szCs w:val="21"/>
+        </w:rPr>
+        <w:t xml:space="preserve">.</w:t>
+      </w:r>
+    </w:p>
+    <w:p>
+      <w:pPr>
         <w:pStyle w:val="Heading2"/>
         <w:spacing w:after="100" w:before="200"/>
       </w:pPr>
@@ -2786,8 +2867,8 @@
             <w:r>
               <w:rPr>
                 <w:rFonts w:ascii="Consolas" w:cs="Consolas" w:eastAsia="Consolas" w:hAnsi="Consolas"/>
-                <w:sz w:val="16"/>
-                <w:szCs w:val="16"/>
+                <w:sz w:val="18"/>
+                <w:szCs w:val="18"/>
               </w:rPr>
               <w:t xml:space="preserve"># Prompt: bring the distribution module up to the module norms (v0.1.4)</w:t>
             </w:r>
@@ -2799,8 +2880,8 @@
             <w:r>
               <w:rPr>
                 <w:rFonts w:ascii="Consolas" w:cs="Consolas" w:eastAsia="Consolas" w:hAnsi="Consolas"/>
-                <w:sz w:val="16"/>
-                <w:szCs w:val="16"/>
+                <w:sz w:val="18"/>
+                <w:szCs w:val="18"/>
               </w:rPr>
               <w:t xml:space="preserve"> </w:t>
             </w:r>
@@ -2812,8 +2893,8 @@
             <w:r>
               <w:rPr>
                 <w:rFonts w:ascii="Consolas" w:cs="Consolas" w:eastAsia="Consolas" w:hAnsi="Consolas"/>
-                <w:sz w:val="16"/>
-                <w:szCs w:val="16"/>
+                <w:sz w:val="18"/>
+                <w:szCs w:val="18"/>
               </w:rPr>
               <w:t xml:space="preserve">The distribution module already exists (`excel_ai/CPAT-AI-Distribution-Prototype_v0.1.3.xlsm`, sources in `excel_ai/distribution/`). This prompt does not rebuild it: it links it through `permalink_countryeditable/`, checks it against legacy, and closes the open items of the module norms. Paste this whole file into GitHub Copilot (Current checkout, Interactive, Claude Opus), with `@AGENTS.md` attached, or attach this file and type "Follow this file. Do phase 0 only, then stop and report." Work one phase per message. Human guide: `CPAT-AI_HowTo_Distribution.docx` in this folder.</w:t>
             </w:r>
@@ -2825,8 +2906,8 @@
             <w:r>
               <w:rPr>
                 <w:rFonts w:ascii="Consolas" w:cs="Consolas" w:eastAsia="Consolas" w:hAnsi="Consolas"/>
-                <w:sz w:val="16"/>
-                <w:szCs w:val="16"/>
+                <w:sz w:val="18"/>
+                <w:szCs w:val="18"/>
               </w:rPr>
               <w:t xml:space="preserve"> </w:t>
             </w:r>
@@ -2838,8 +2919,8 @@
             <w:r>
               <w:rPr>
                 <w:rFonts w:ascii="Consolas" w:cs="Consolas" w:eastAsia="Consolas" w:hAnsi="Consolas"/>
-                <w:sz w:val="16"/>
-                <w:szCs w:val="16"/>
+                <w:sz w:val="18"/>
+                <w:szCs w:val="18"/>
               </w:rPr>
               <w:t xml:space="preserve">---</w:t>
             </w:r>
@@ -2851,8 +2932,8 @@
             <w:r>
               <w:rPr>
                 <w:rFonts w:ascii="Consolas" w:cs="Consolas" w:eastAsia="Consolas" w:hAnsi="Consolas"/>
-                <w:sz w:val="16"/>
-                <w:szCs w:val="16"/>
+                <w:sz w:val="18"/>
+                <w:szCs w:val="18"/>
               </w:rPr>
               <w:t xml:space="preserve"> </w:t>
             </w:r>
@@ -2864,8 +2945,8 @@
             <w:r>
               <w:rPr>
                 <w:rFonts w:ascii="Consolas" w:cs="Consolas" w:eastAsia="Consolas" w:hAnsi="Consolas"/>
-                <w:sz w:val="16"/>
-                <w:szCs w:val="16"/>
+                <w:sz w:val="18"/>
+                <w:szCs w:val="18"/>
               </w:rPr>
               <w:t xml:space="preserve">You are working in the CPAT-AI repository on the local checkout. Follow `AGENTS.md` and every document it points to, above all `NORMS.md` section 0 (bugs and issues), section 1.1b (the distribution layout) and **section 9 (how modules work)**. Read before you start: `excel_ai/distribution/README.md`, `build_distribution.py`, `CPATDistribution.bas`, `check_distribution.py` and its last report; `excel_ai/plans/Modules.md` (M3, M6); the distribution items of the register (`excel_ai/mitigation/issues_register.py`, Module = Distribution; former codes D1-D31, DI1-DI4) and of `excel_ai/BUGS.md` and `excel_ai/ISSUES.md`; `other/distribution/LESSONS_LEARNED.md`; `excel_ai/mitigation/distribution_ref.py`; the bottom of `CAVEATS.md`.</w:t>
             </w:r>
@@ -2877,8 +2958,8 @@
             <w:r>
               <w:rPr>
                 <w:rFonts w:ascii="Consolas" w:cs="Consolas" w:eastAsia="Consolas" w:hAnsi="Consolas"/>
-                <w:sz w:val="16"/>
-                <w:szCs w:val="16"/>
+                <w:sz w:val="18"/>
+                <w:szCs w:val="18"/>
               </w:rPr>
               <w:t xml:space="preserve"> </w:t>
             </w:r>
@@ -2890,8 +2971,8 @@
             <w:r>
               <w:rPr>
                 <w:rFonts w:ascii="Consolas" w:cs="Consolas" w:eastAsia="Consolas" w:hAnsi="Consolas"/>
-                <w:sz w:val="16"/>
-                <w:szCs w:val="16"/>
+                <w:sz w:val="18"/>
+                <w:szCs w:val="18"/>
               </w:rPr>
               <w:t xml:space="preserve">## Rules (do not break them)</w:t>
             </w:r>
@@ -2903,8 +2984,8 @@
             <w:r>
               <w:rPr>
                 <w:rFonts w:ascii="Consolas" w:cs="Consolas" w:eastAsia="Consolas" w:hAnsi="Consolas"/>
-                <w:sz w:val="16"/>
-                <w:szCs w:val="16"/>
+                <w:sz w:val="18"/>
+                <w:szCs w:val="18"/>
               </w:rPr>
               <w:t xml:space="preserve"> </w:t>
             </w:r>
@@ -2916,8 +2997,8 @@
             <w:r>
               <w:rPr>
                 <w:rFonts w:ascii="Consolas" w:cs="Consolas" w:eastAsia="Consolas" w:hAnsi="Consolas"/>
-                <w:sz w:val="16"/>
-                <w:szCs w:val="16"/>
+                <w:sz w:val="18"/>
+                <w:szCs w:val="18"/>
               </w:rPr>
               <w:t xml:space="preserve">1. **Legacy first** (the legacy `Distribution` sheet of `excel_ai/legacy/workbooks/CPAT 1.0pre_465_NoPropData.xlsb`, read-only). Never replicate a legacy bug: fix it and register it (`L`, with cells and a cell-level fix plan). Always replicate a legacy issue and register it (`I`). When unsure, treat it as an issue, replicate it, and ask me. Next free codes from `register.py`; one register, no list of your own.</w:t>
             </w:r>
@@ -2929,8 +3010,8 @@
             <w:r>
               <w:rPr>
                 <w:rFonts w:ascii="Consolas" w:cs="Consolas" w:eastAsia="Consolas" w:hAnsi="Consolas"/>
-                <w:sz w:val="16"/>
-                <w:szCs w:val="16"/>
+                <w:sz w:val="18"/>
+                <w:szCs w:val="18"/>
               </w:rPr>
               <w:t xml:space="preserve">2. **The distribution formulas have one source**: `excel_ai/mitigation/build.py`. The module is cut from the built prototype. Change a formula there, rebuild the prototype, then rebuild the module; never edit the module workbook by hand.</w:t>
             </w:r>
@@ -2942,8 +3023,8 @@
             <w:r>
               <w:rPr>
                 <w:rFonts w:ascii="Consolas" w:cs="Consolas" w:eastAsia="Consolas" w:hAnsi="Consolas"/>
-                <w:sz w:val="16"/>
-                <w:szCs w:val="16"/>
+                <w:sz w:val="18"/>
+                <w:szCs w:val="18"/>
               </w:rPr>
               <w:t xml:space="preserve">3. **Column norms**: the distribution layout of `NORMS.md` 1.1b (A-J descriptors as Mitigation; per group a code column, basket, deciles 1-10, spacer; group *n* reads Mitigation group *n*); `FromMitigation` keeps the Mitigation column layout (1.1, 9.2).</w:t>
             </w:r>
@@ -2955,8 +3036,8 @@
             <w:r>
               <w:rPr>
                 <w:rFonts w:ascii="Consolas" w:cs="Consolas" w:eastAsia="Consolas" w:hAnsi="Consolas"/>
-                <w:sz w:val="16"/>
-                <w:szCs w:val="16"/>
+                <w:sz w:val="18"/>
+                <w:szCs w:val="18"/>
               </w:rPr>
               <w:t xml:space="preserve">4. **Encapsulated**: the `Distribution` sheet reads only `FromMitigation`, `ScenarioDefinition`, its data tabs and Settings constants (NORMS 9.2); its results stay on the `Distribution` sheet under the LiveOutputs codes `&lt;iso&gt;.distn.*`, because no other workbook reads them yet (an output tab of plain copies, NORMS 9.2, is added only if I agree).</w:t>
             </w:r>
@@ -2968,10 +3049,10 @@
             <w:r>
               <w:rPr>
                 <w:rFonts w:ascii="Consolas" w:cs="Consolas" w:eastAsia="Consolas" w:hAnsi="Consolas"/>
-                <w:sz w:val="16"/>
-                <w:szCs w:val="16"/>
-              </w:rPr>
-              <w:t xml:space="preserve">5. Excel rules as `NORMS.md` 3, 3b, 3d, 3g, 3h. Never commit real data. Do not commit or push unless I ask.</w:t>
+                <w:sz w:val="18"/>
+                <w:szCs w:val="18"/>
+              </w:rPr>
+              <w:t xml:space="preserve">5. Excel rules as `NORMS.md` 3, 3b, 3d, 3g, 3h. If Python, openpyxl or LibreOffice is missing on this computer, say so before you start: install nothing without my OK; where LibreOffice is missing, skip the recalculation steps and list what was not run (I review in Excel 365). Never commit real data. Do not commit or push unless I ask.</w:t>
             </w:r>
           </w:p>
           <w:p>
@@ -2981,8 +3062,8 @@
             <w:r>
               <w:rPr>
                 <w:rFonts w:ascii="Consolas" w:cs="Consolas" w:eastAsia="Consolas" w:hAnsi="Consolas"/>
-                <w:sz w:val="16"/>
-                <w:szCs w:val="16"/>
+                <w:sz w:val="18"/>
+                <w:szCs w:val="18"/>
               </w:rPr>
               <w:t xml:space="preserve"> </w:t>
             </w:r>
@@ -2994,8 +3075,8 @@
             <w:r>
               <w:rPr>
                 <w:rFonts w:ascii="Consolas" w:cs="Consolas" w:eastAsia="Consolas" w:hAnsi="Consolas"/>
-                <w:sz w:val="16"/>
-                <w:szCs w:val="16"/>
+                <w:sz w:val="18"/>
+                <w:szCs w:val="18"/>
               </w:rPr>
               <w:t xml:space="preserve">## Phases (one per message; stop after each and report)</w:t>
             </w:r>
@@ -3007,8 +3088,8 @@
             <w:r>
               <w:rPr>
                 <w:rFonts w:ascii="Consolas" w:cs="Consolas" w:eastAsia="Consolas" w:hAnsi="Consolas"/>
-                <w:sz w:val="16"/>
-                <w:szCs w:val="16"/>
+                <w:sz w:val="18"/>
+                <w:szCs w:val="18"/>
               </w:rPr>
               <w:t xml:space="preserve"> </w:t>
             </w:r>
@@ -3020,8 +3101,8 @@
             <w:r>
               <w:rPr>
                 <w:rFonts w:ascii="Consolas" w:cs="Consolas" w:eastAsia="Consolas" w:hAnsi="Consolas"/>
-                <w:sz w:val="16"/>
-                <w:szCs w:val="16"/>
+                <w:sz w:val="18"/>
+                <w:szCs w:val="18"/>
               </w:rPr>
               <w:t xml:space="preserve">**Phase 0. Review (no change).** Build nothing. Report: (a) how the module meets `NORMS.md` section 9, item by item, and what is missing; (b) the macro's file search (it looks for the mitigation workbook next to the module, in `permalink\`, one folder up, then in `permalink\` one folder up: it does **not** look in `permalink_countryeditable\` yet, NORMS 5a and 9.3); (c) the distribution bugs and issues in the register on 465 (any legacy 465 change to the `Distribution` sheet since 456: rows moved, bugs the CPAT team fixed); (d) the date and result of the last `check_distribution.py`; (e) the Cover: its title and version log still use the old numbering (v1.3 for 0.1.3) and not the version-table columns of NORMS 5b (Version, Date, Description, Max abs regression diff).</w:t>
             </w:r>
@@ -3033,8 +3114,8 @@
             <w:r>
               <w:rPr>
                 <w:rFonts w:ascii="Consolas" w:cs="Consolas" w:eastAsia="Consolas" w:hAnsi="Consolas"/>
-                <w:sz w:val="16"/>
-                <w:szCs w:val="16"/>
+                <w:sz w:val="18"/>
+                <w:szCs w:val="18"/>
               </w:rPr>
               <w:t xml:space="preserve"> </w:t>
             </w:r>
@@ -3046,8 +3127,8 @@
             <w:r>
               <w:rPr>
                 <w:rFonts w:ascii="Consolas" w:cs="Consolas" w:eastAsia="Consolas" w:hAnsi="Consolas"/>
-                <w:sz w:val="16"/>
-                <w:szCs w:val="16"/>
+                <w:sz w:val="18"/>
+                <w:szCs w:val="18"/>
               </w:rPr>
               <w:t xml:space="preserve">**Phase 1. Link through `permalink_countryeditable/`.** In `CPATDistribution.bas` (`MitPath`): look first in `permalink_countryeditable\` (next to the module, then one folder up), then the current places; Cover says which file was used (link table: path, saved time, scenario names). Same change in the builder's Cover text and README. Test the search order with a Python emulation of the macro and the VBA name scan of `check_distribution.py`.</w:t>
             </w:r>
@@ -3059,8 +3140,8 @@
             <w:r>
               <w:rPr>
                 <w:rFonts w:ascii="Consolas" w:cs="Consolas" w:eastAsia="Consolas" w:hAnsi="Consolas"/>
-                <w:sz w:val="16"/>
-                <w:szCs w:val="16"/>
+                <w:sz w:val="18"/>
+                <w:szCs w:val="18"/>
               </w:rPr>
               <w:t xml:space="preserve"> </w:t>
             </w:r>
@@ -3072,8 +3153,8 @@
             <w:r>
               <w:rPr>
                 <w:rFonts w:ascii="Consolas" w:cs="Consolas" w:eastAsia="Consolas" w:hAnsi="Consolas"/>
-                <w:sz w:val="16"/>
-                <w:szCs w:val="16"/>
+                <w:sz w:val="18"/>
+                <w:szCs w:val="18"/>
               </w:rPr>
               <w:t xml:space="preserve">**Phase 2. Legacy check on 465.** Compare the module (Egypt, the scenario of the prototype) with legacy 465's cached `Distribution` values and `MTOutputs` distribution results, decile by decile, through `distribution_ref.py`; every difference explained by a registered bug fix or issue, or reported as new. Register what is new.</w:t>
             </w:r>
@@ -3085,8 +3166,8 @@
             <w:r>
               <w:rPr>
                 <w:rFonts w:ascii="Consolas" w:cs="Consolas" w:eastAsia="Consolas" w:hAnsi="Consolas"/>
-                <w:sz w:val="16"/>
-                <w:szCs w:val="16"/>
+                <w:sz w:val="18"/>
+                <w:szCs w:val="18"/>
               </w:rPr>
               <w:t xml:space="preserve"> </w:t>
             </w:r>
@@ -3098,8 +3179,8 @@
             <w:r>
               <w:rPr>
                 <w:rFonts w:ascii="Consolas" w:cs="Consolas" w:eastAsia="Consolas" w:hAnsi="Consolas"/>
-                <w:sz w:val="16"/>
-                <w:szCs w:val="16"/>
+                <w:sz w:val="18"/>
+                <w:szCs w:val="18"/>
               </w:rPr>
               <w:t xml:space="preserve">**Phase 3. Release.** Bump `VERSION` to 0.1.4, rebuild (`python excel_ai/distribution/build_distribution.py`), run `python excel_ai/distribution/check_distribution.py` (PASS), lint, publish with `release.py` `publish(link=True)` to `excel_ai/`, `releases/`, `permalink/` and `permalink_countryeditable/`. Cover title and version table in the 0.1.x numbering and the NORMS 5b columns, with a row naming the mitigation version used. Update `excel_ai/distribution/README.md`, `excel_ai/plans/TODO.md` (M6: distribution done), the register lists, and add the entry at the bottom of `CAVEATS.md`.</w:t>
             </w:r>
@@ -3111,8 +3192,8 @@
             <w:r>
               <w:rPr>
                 <w:rFonts w:ascii="Consolas" w:cs="Consolas" w:eastAsia="Consolas" w:hAnsi="Consolas"/>
-                <w:sz w:val="16"/>
-                <w:szCs w:val="16"/>
+                <w:sz w:val="18"/>
+                <w:szCs w:val="18"/>
               </w:rPr>
               <w:t xml:space="preserve"> </w:t>
             </w:r>
@@ -3124,8 +3205,8 @@
             <w:r>
               <w:rPr>
                 <w:rFonts w:ascii="Consolas" w:cs="Consolas" w:eastAsia="Consolas" w:hAnsi="Consolas"/>
-                <w:sz w:val="16"/>
-                <w:szCs w:val="16"/>
+                <w:sz w:val="18"/>
+                <w:szCs w:val="18"/>
               </w:rPr>
               <w:t xml:space="preserve">## Report after each phase</w:t>
             </w:r>
@@ -3137,8 +3218,8 @@
             <w:r>
               <w:rPr>
                 <w:rFonts w:ascii="Consolas" w:cs="Consolas" w:eastAsia="Consolas" w:hAnsi="Consolas"/>
-                <w:sz w:val="16"/>
-                <w:szCs w:val="16"/>
+                <w:sz w:val="18"/>
+                <w:szCs w:val="18"/>
               </w:rPr>
               <w:t xml:space="preserve"> </w:t>
             </w:r>
@@ -3150,8 +3231,8 @@
             <w:r>
               <w:rPr>
                 <w:rFonts w:ascii="Consolas" w:cs="Consolas" w:eastAsia="Consolas" w:hAnsi="Consolas"/>
-                <w:sz w:val="16"/>
-                <w:szCs w:val="16"/>
+                <w:sz w:val="18"/>
+                <w:szCs w:val="18"/>
               </w:rPr>
               <w:t xml:space="preserve">What you did; files changed; check results (PASS/FAIL with numbers); bugs and issues (codes); open questions for me. Do not go to the next phase until I say so.</w:t>
             </w:r>
@@ -3159,6 +3240,855 @@
         </w:tc>
       </w:tr>
     </w:tbl>
+    <w:p>
+      <w:r>
+        <w:br w:type="page"/>
+      </w:r>
+    </w:p>
+    <w:p>
+      <w:pPr>
+        <w:pStyle w:val="Heading1"/>
+        <w:spacing w:after="120" w:before="280"/>
+      </w:pPr>
+      <w:r>
+        <w:rPr>
+          <w:rFonts w:ascii="Arial" w:cs="Arial" w:eastAsia="Arial" w:hAnsi="Arial"/>
+          <w:b/>
+          <w:bCs/>
+          <w:color w:val="00AE49"/>
+          <w:sz w:val="30"/>
+          <w:szCs w:val="30"/>
+        </w:rPr>
+        <w:t xml:space="preserve">Appendix B. Starter and follow-up prompts</w:t>
+      </w:r>
+    </w:p>
+    <w:p>
+      <w:pPr>
+        <w:spacing w:after="120"/>
+      </w:pPr>
+      <w:r>
+        <w:rPr>
+          <w:rFonts w:ascii="Arial" w:cs="Arial" w:eastAsia="Arial" w:hAnsi="Arial"/>
+          <w:sz w:val="21"/>
+          <w:szCs w:val="21"/>
+        </w:rPr>
+        <w:t xml:space="preserve">The content of </w:t>
+      </w:r>
+      <w:r>
+        <w:rPr>
+          <w:rFonts w:ascii="Consolas" w:cs="Consolas" w:eastAsia="Consolas" w:hAnsi="Consolas"/>
+          <w:sz w:val="19"/>
+          <w:szCs w:val="19"/>
+        </w:rPr>
+        <w:t xml:space="preserve">excel_ai/plans/prompts/Distribution_starter_prompts.md</w:t>
+      </w:r>
+      <w:r>
+        <w:rPr>
+          <w:rFonts w:ascii="Arial" w:cs="Arial" w:eastAsia="Arial" w:hAnsi="Arial"/>
+          <w:sz w:val="21"/>
+          <w:szCs w:val="21"/>
+        </w:rPr>
+        <w:t xml:space="preserve">. Type or paste one box at a time.</w:t>
+      </w:r>
+    </w:p>
+    <w:p>
+      <w:pPr>
+        <w:spacing w:after="120"/>
+      </w:pPr>
+      <w:r>
+        <w:rPr>
+          <w:rFonts w:ascii="Arial" w:cs="Arial" w:eastAsia="Arial" w:hAnsi="Arial"/>
+          <w:sz w:val="21"/>
+          <w:szCs w:val="21"/>
+        </w:rPr>
+        <w:t xml:space="preserve">Short prompts to type into GitHub Copilot (Current checkout, Claude Opus, Interactive). The long instructions are in </w:t>
+      </w:r>
+      <w:r>
+        <w:rPr>
+          <w:rFonts w:ascii="Consolas" w:cs="Consolas" w:eastAsia="Consolas" w:hAnsi="Consolas"/>
+          <w:sz w:val="19"/>
+          <w:szCs w:val="19"/>
+        </w:rPr>
+        <w:t xml:space="preserve">Distribution_module_prompt.md</w:t>
+      </w:r>
+      <w:r>
+        <w:rPr>
+          <w:rFonts w:ascii="Arial" w:cs="Arial" w:eastAsia="Arial" w:hAnsi="Arial"/>
+          <w:sz w:val="21"/>
+          <w:szCs w:val="21"/>
+        </w:rPr>
+        <w:t xml:space="preserve">; Copilot reads them from the repo, so you never paste them. Send one prompt, read the report, then send the next.</w:t>
+      </w:r>
+    </w:p>
+    <w:p>
+      <w:pPr>
+        <w:pStyle w:val="Heading2"/>
+        <w:spacing w:after="100" w:before="200"/>
+      </w:pPr>
+      <w:r>
+        <w:rPr>
+          <w:rFonts w:ascii="Arial" w:cs="Arial" w:eastAsia="Arial" w:hAnsi="Arial"/>
+          <w:b/>
+          <w:bCs/>
+          <w:sz w:val="24"/>
+          <w:szCs w:val="24"/>
+        </w:rPr>
+        <w:t xml:space="preserve">Starter (new session)</w:t>
+      </w:r>
+    </w:p>
+    <w:p>
+      <w:pPr>
+        <w:spacing w:after="120"/>
+      </w:pPr>
+      <w:r>
+        <w:rPr>
+          <w:rFonts w:ascii="Arial" w:cs="Arial" w:eastAsia="Arial" w:hAnsi="Arial"/>
+          <w:sz w:val="21"/>
+          <w:szCs w:val="21"/>
+        </w:rPr>
+        <w:t xml:space="preserve">Type </w:t>
+      </w:r>
+      <w:r>
+        <w:rPr>
+          <w:rFonts w:ascii="Consolas" w:cs="Consolas" w:eastAsia="Consolas" w:hAnsi="Consolas"/>
+          <w:sz w:val="19"/>
+          <w:szCs w:val="19"/>
+        </w:rPr>
+        <w:t xml:space="preserve">@</w:t>
+      </w:r>
+      <w:r>
+        <w:rPr>
+          <w:rFonts w:ascii="Arial" w:cs="Arial" w:eastAsia="Arial" w:hAnsi="Arial"/>
+          <w:sz w:val="21"/>
+          <w:szCs w:val="21"/>
+        </w:rPr>
+        <w:t xml:space="preserve"> to attach the two files, then:</w:t>
+      </w:r>
+    </w:p>
+    <w:tbl>
+      <w:tblPr>
+        <w:tblW w:type="dxa" w:w="9360"/>
+        <w:tblBorders>
+          <w:top w:val="single" w:color="auto" w:sz="4"/>
+          <w:left w:val="single" w:color="auto" w:sz="4"/>
+          <w:bottom w:val="single" w:color="auto" w:sz="4"/>
+          <w:right w:val="single" w:color="auto" w:sz="4"/>
+          <w:insideH w:val="single" w:color="auto" w:sz="4"/>
+          <w:insideV w:val="single" w:color="auto" w:sz="4"/>
+        </w:tblBorders>
+      </w:tblPr>
+      <w:tblGrid>
+        <w:gridCol w:w="9360"/>
+      </w:tblGrid>
+      <w:tr>
+        <w:tc>
+          <w:tcPr>
+            <w:tcW w:type="dxa" w:w="9360"/>
+            <w:tcBorders>
+              <w:top w:val="single" w:color="BFBFBF" w:sz="6"/>
+              <w:left w:val="single" w:color="BFBFBF" w:sz="6"/>
+              <w:bottom w:val="single" w:color="BFBFBF" w:sz="6"/>
+              <w:right w:val="single" w:color="BFBFBF" w:sz="6"/>
+            </w:tcBorders>
+            <w:shd w:fill="F2F2F2" w:color="auto" w:val="clear"/>
+            <w:tcMar>
+              <w:top w:type="dxa" w:w="100"/>
+              <w:left w:type="dxa" w:w="140"/>
+              <w:bottom w:type="dxa" w:w="100"/>
+              <w:right w:type="dxa" w:w="140"/>
+            </w:tcMar>
+          </w:tcPr>
+          <w:p>
+            <w:pPr>
+              <w:spacing w:after="0"/>
+            </w:pPr>
+            <w:r>
+              <w:rPr>
+                <w:rFonts w:ascii="Consolas" w:cs="Consolas" w:eastAsia="Consolas" w:hAnsi="Consolas"/>
+                <w:sz w:val="18"/>
+                <w:szCs w:val="18"/>
+              </w:rPr>
+              <w:t xml:space="preserve">@AGENTS.md @excel_ai/plans/prompts/Distribution_module_prompt.md Follow these files. Do phase 0 only, then stop and report.</w:t>
+            </w:r>
+          </w:p>
+        </w:tc>
+      </w:tr>
+    </w:tbl>
+    <w:p>
+      <w:pPr>
+        <w:spacing w:after="80"/>
+      </w:pPr>
+    </w:p>
+    <w:p>
+      <w:pPr>
+        <w:spacing w:after="120"/>
+      </w:pPr>
+      <w:r>
+        <w:rPr>
+          <w:rFonts w:ascii="Arial" w:cs="Arial" w:eastAsia="Arial" w:hAnsi="Arial"/>
+          <w:sz w:val="21"/>
+          <w:szCs w:val="21"/>
+        </w:rPr>
+        <w:t xml:space="preserve">If </w:t>
+      </w:r>
+      <w:r>
+        <w:rPr>
+          <w:rFonts w:ascii="Consolas" w:cs="Consolas" w:eastAsia="Consolas" w:hAnsi="Consolas"/>
+          <w:sz w:val="19"/>
+          <w:szCs w:val="19"/>
+        </w:rPr>
+        <w:t xml:space="preserve">excel_ai/plans/prompts/</w:t>
+      </w:r>
+      <w:r>
+        <w:rPr>
+          <w:rFonts w:ascii="Arial" w:cs="Arial" w:eastAsia="Arial" w:hAnsi="Arial"/>
+          <w:sz w:val="21"/>
+          <w:szCs w:val="21"/>
+        </w:rPr>
+        <w:t xml:space="preserve"> is not in your checkout yet (the branch is not merged), sync first; if it is still missing, paste the whole of </w:t>
+      </w:r>
+      <w:r>
+        <w:rPr>
+          <w:rFonts w:ascii="Consolas" w:cs="Consolas" w:eastAsia="Consolas" w:hAnsi="Consolas"/>
+          <w:sz w:val="19"/>
+          <w:szCs w:val="19"/>
+        </w:rPr>
+        <w:t xml:space="preserve">Distribution_module_prompt.md</w:t>
+      </w:r>
+      <w:r>
+        <w:rPr>
+          <w:rFonts w:ascii="Arial" w:cs="Arial" w:eastAsia="Arial" w:hAnsi="Arial"/>
+          <w:sz w:val="21"/>
+          <w:szCs w:val="21"/>
+        </w:rPr>
+        <w:t xml:space="preserve"> instead (Appendix A of the Word guide).</w:t>
+      </w:r>
+    </w:p>
+    <w:p>
+      <w:pPr>
+        <w:pStyle w:val="Heading2"/>
+        <w:spacing w:after="100" w:before="200"/>
+      </w:pPr>
+      <w:r>
+        <w:rPr>
+          <w:rFonts w:ascii="Arial" w:cs="Arial" w:eastAsia="Arial" w:hAnsi="Arial"/>
+          <w:b/>
+          <w:bCs/>
+          <w:sz w:val="24"/>
+          <w:szCs w:val="24"/>
+        </w:rPr>
+        <w:t xml:space="preserve">Next phases</w:t>
+      </w:r>
+    </w:p>
+    <w:tbl>
+      <w:tblPr>
+        <w:tblW w:type="dxa" w:w="9360"/>
+        <w:tblBorders>
+          <w:top w:val="single" w:color="auto" w:sz="4"/>
+          <w:left w:val="single" w:color="auto" w:sz="4"/>
+          <w:bottom w:val="single" w:color="auto" w:sz="4"/>
+          <w:right w:val="single" w:color="auto" w:sz="4"/>
+          <w:insideH w:val="single" w:color="auto" w:sz="4"/>
+          <w:insideV w:val="single" w:color="auto" w:sz="4"/>
+        </w:tblBorders>
+      </w:tblPr>
+      <w:tblGrid>
+        <w:gridCol w:w="9360"/>
+      </w:tblGrid>
+      <w:tr>
+        <w:tc>
+          <w:tcPr>
+            <w:tcW w:type="dxa" w:w="9360"/>
+            <w:tcBorders>
+              <w:top w:val="single" w:color="BFBFBF" w:sz="6"/>
+              <w:left w:val="single" w:color="BFBFBF" w:sz="6"/>
+              <w:bottom w:val="single" w:color="BFBFBF" w:sz="6"/>
+              <w:right w:val="single" w:color="BFBFBF" w:sz="6"/>
+            </w:tcBorders>
+            <w:shd w:fill="F2F2F2" w:color="auto" w:val="clear"/>
+            <w:tcMar>
+              <w:top w:type="dxa" w:w="100"/>
+              <w:left w:type="dxa" w:w="140"/>
+              <w:bottom w:type="dxa" w:w="100"/>
+              <w:right w:type="dxa" w:w="140"/>
+            </w:tcMar>
+          </w:tcPr>
+          <w:p>
+            <w:pPr>
+              <w:spacing w:after="0"/>
+            </w:pPr>
+            <w:r>
+              <w:rPr>
+                <w:rFonts w:ascii="Consolas" w:cs="Consolas" w:eastAsia="Consolas" w:hAnsi="Consolas"/>
+                <w:sz w:val="18"/>
+                <w:szCs w:val="18"/>
+              </w:rPr>
+              <w:t xml:space="preserve">Go ahead with phase 1.</w:t>
+            </w:r>
+          </w:p>
+        </w:tc>
+      </w:tr>
+    </w:tbl>
+    <w:p>
+      <w:pPr>
+        <w:spacing w:after="80"/>
+      </w:pPr>
+    </w:p>
+    <w:tbl>
+      <w:tblPr>
+        <w:tblW w:type="dxa" w:w="9360"/>
+        <w:tblBorders>
+          <w:top w:val="single" w:color="auto" w:sz="4"/>
+          <w:left w:val="single" w:color="auto" w:sz="4"/>
+          <w:bottom w:val="single" w:color="auto" w:sz="4"/>
+          <w:right w:val="single" w:color="auto" w:sz="4"/>
+          <w:insideH w:val="single" w:color="auto" w:sz="4"/>
+          <w:insideV w:val="single" w:color="auto" w:sz="4"/>
+        </w:tblBorders>
+      </w:tblPr>
+      <w:tblGrid>
+        <w:gridCol w:w="9360"/>
+      </w:tblGrid>
+      <w:tr>
+        <w:tc>
+          <w:tcPr>
+            <w:tcW w:type="dxa" w:w="9360"/>
+            <w:tcBorders>
+              <w:top w:val="single" w:color="BFBFBF" w:sz="6"/>
+              <w:left w:val="single" w:color="BFBFBF" w:sz="6"/>
+              <w:bottom w:val="single" w:color="BFBFBF" w:sz="6"/>
+              <w:right w:val="single" w:color="BFBFBF" w:sz="6"/>
+            </w:tcBorders>
+            <w:shd w:fill="F2F2F2" w:color="auto" w:val="clear"/>
+            <w:tcMar>
+              <w:top w:type="dxa" w:w="100"/>
+              <w:left w:type="dxa" w:w="140"/>
+              <w:bottom w:type="dxa" w:w="100"/>
+              <w:right w:type="dxa" w:w="140"/>
+            </w:tcMar>
+          </w:tcPr>
+          <w:p>
+            <w:pPr>
+              <w:spacing w:after="0"/>
+            </w:pPr>
+            <w:r>
+              <w:rPr>
+                <w:rFonts w:ascii="Consolas" w:cs="Consolas" w:eastAsia="Consolas" w:hAnsi="Consolas"/>
+                <w:sz w:val="18"/>
+                <w:szCs w:val="18"/>
+              </w:rPr>
+              <w:t xml:space="preserve">Go ahead with phase 2.</w:t>
+            </w:r>
+          </w:p>
+        </w:tc>
+      </w:tr>
+    </w:tbl>
+    <w:p>
+      <w:pPr>
+        <w:spacing w:after="80"/>
+      </w:pPr>
+    </w:p>
+    <w:tbl>
+      <w:tblPr>
+        <w:tblW w:type="dxa" w:w="9360"/>
+        <w:tblBorders>
+          <w:top w:val="single" w:color="auto" w:sz="4"/>
+          <w:left w:val="single" w:color="auto" w:sz="4"/>
+          <w:bottom w:val="single" w:color="auto" w:sz="4"/>
+          <w:right w:val="single" w:color="auto" w:sz="4"/>
+          <w:insideH w:val="single" w:color="auto" w:sz="4"/>
+          <w:insideV w:val="single" w:color="auto" w:sz="4"/>
+        </w:tblBorders>
+      </w:tblPr>
+      <w:tblGrid>
+        <w:gridCol w:w="9360"/>
+      </w:tblGrid>
+      <w:tr>
+        <w:tc>
+          <w:tcPr>
+            <w:tcW w:type="dxa" w:w="9360"/>
+            <w:tcBorders>
+              <w:top w:val="single" w:color="BFBFBF" w:sz="6"/>
+              <w:left w:val="single" w:color="BFBFBF" w:sz="6"/>
+              <w:bottom w:val="single" w:color="BFBFBF" w:sz="6"/>
+              <w:right w:val="single" w:color="BFBFBF" w:sz="6"/>
+            </w:tcBorders>
+            <w:shd w:fill="F2F2F2" w:color="auto" w:val="clear"/>
+            <w:tcMar>
+              <w:top w:type="dxa" w:w="100"/>
+              <w:left w:type="dxa" w:w="140"/>
+              <w:bottom w:type="dxa" w:w="100"/>
+              <w:right w:type="dxa" w:w="140"/>
+            </w:tcMar>
+          </w:tcPr>
+          <w:p>
+            <w:pPr>
+              <w:spacing w:after="0"/>
+            </w:pPr>
+            <w:r>
+              <w:rPr>
+                <w:rFonts w:ascii="Consolas" w:cs="Consolas" w:eastAsia="Consolas" w:hAnsi="Consolas"/>
+                <w:sz w:val="18"/>
+                <w:szCs w:val="18"/>
+              </w:rPr>
+              <w:t xml:space="preserve">Go ahead with phase 3.</w:t>
+            </w:r>
+          </w:p>
+        </w:tc>
+      </w:tr>
+    </w:tbl>
+    <w:p>
+      <w:pPr>
+        <w:spacing w:after="80"/>
+      </w:pPr>
+    </w:p>
+    <w:p>
+      <w:pPr>
+        <w:pStyle w:val="Heading2"/>
+        <w:spacing w:after="100" w:before="200"/>
+      </w:pPr>
+      <w:r>
+        <w:rPr>
+          <w:rFonts w:ascii="Arial" w:cs="Arial" w:eastAsia="Arial" w:hAnsi="Arial"/>
+          <w:b/>
+          <w:bCs/>
+          <w:sz w:val="24"/>
+          <w:szCs w:val="24"/>
+        </w:rPr>
+        <w:t xml:space="preserve">Example follow-ups</w:t>
+      </w:r>
+    </w:p>
+    <w:p>
+      <w:pPr>
+        <w:spacing w:after="120"/>
+      </w:pPr>
+      <w:r>
+        <w:rPr>
+          <w:rFonts w:ascii="Arial" w:cs="Arial" w:eastAsia="Arial" w:hAnsi="Arial"/>
+          <w:sz w:val="21"/>
+          <w:szCs w:val="21"/>
+        </w:rPr>
+        <w:t xml:space="preserve">Look at one result:</w:t>
+      </w:r>
+    </w:p>
+    <w:tbl>
+      <w:tblPr>
+        <w:tblW w:type="dxa" w:w="9360"/>
+        <w:tblBorders>
+          <w:top w:val="single" w:color="auto" w:sz="4"/>
+          <w:left w:val="single" w:color="auto" w:sz="4"/>
+          <w:bottom w:val="single" w:color="auto" w:sz="4"/>
+          <w:right w:val="single" w:color="auto" w:sz="4"/>
+          <w:insideH w:val="single" w:color="auto" w:sz="4"/>
+          <w:insideV w:val="single" w:color="auto" w:sz="4"/>
+        </w:tblBorders>
+      </w:tblPr>
+      <w:tblGrid>
+        <w:gridCol w:w="9360"/>
+      </w:tblGrid>
+      <w:tr>
+        <w:tc>
+          <w:tcPr>
+            <w:tcW w:type="dxa" w:w="9360"/>
+            <w:tcBorders>
+              <w:top w:val="single" w:color="BFBFBF" w:sz="6"/>
+              <w:left w:val="single" w:color="BFBFBF" w:sz="6"/>
+              <w:bottom w:val="single" w:color="BFBFBF" w:sz="6"/>
+              <w:right w:val="single" w:color="BFBFBF" w:sz="6"/>
+            </w:tcBorders>
+            <w:shd w:fill="F2F2F2" w:color="auto" w:val="clear"/>
+            <w:tcMar>
+              <w:top w:type="dxa" w:w="100"/>
+              <w:left w:type="dxa" w:w="140"/>
+              <w:bottom w:type="dxa" w:w="100"/>
+              <w:right w:type="dxa" w:w="140"/>
+            </w:tcMar>
+          </w:tcPr>
+          <w:p>
+            <w:pPr>
+              <w:spacing w:after="0"/>
+            </w:pPr>
+            <w:r>
+              <w:rPr>
+                <w:rFonts w:ascii="Consolas" w:cs="Consolas" w:eastAsia="Consolas" w:hAnsi="Consolas"/>
+                <w:sz w:val="18"/>
+                <w:szCs w:val="18"/>
+              </w:rPr>
+              <w:t xml:space="preserve">For Egypt, the live scenario, show me the total effect by decile (overall, urban, rural) and the Gini change, next to legacy 465's cached values, with the reason for each difference.</w:t>
+            </w:r>
+          </w:p>
+        </w:tc>
+      </w:tr>
+    </w:tbl>
+    <w:p>
+      <w:pPr>
+        <w:spacing w:after="80"/>
+      </w:pPr>
+    </w:p>
+    <w:p>
+      <w:pPr>
+        <w:spacing w:after="120"/>
+      </w:pPr>
+      <w:r>
+        <w:rPr>
+          <w:rFonts w:ascii="Arial" w:cs="Arial" w:eastAsia="Arial" w:hAnsi="Arial"/>
+          <w:sz w:val="21"/>
+          <w:szCs w:val="21"/>
+        </w:rPr>
+        <w:t xml:space="preserve">Check a legacy bug in the register:</w:t>
+      </w:r>
+    </w:p>
+    <w:tbl>
+      <w:tblPr>
+        <w:tblW w:type="dxa" w:w="9360"/>
+        <w:tblBorders>
+          <w:top w:val="single" w:color="auto" w:sz="4"/>
+          <w:left w:val="single" w:color="auto" w:sz="4"/>
+          <w:bottom w:val="single" w:color="auto" w:sz="4"/>
+          <w:right w:val="single" w:color="auto" w:sz="4"/>
+          <w:insideH w:val="single" w:color="auto" w:sz="4"/>
+          <w:insideV w:val="single" w:color="auto" w:sz="4"/>
+        </w:tblBorders>
+      </w:tblPr>
+      <w:tblGrid>
+        <w:gridCol w:w="9360"/>
+      </w:tblGrid>
+      <w:tr>
+        <w:tc>
+          <w:tcPr>
+            <w:tcW w:type="dxa" w:w="9360"/>
+            <w:tcBorders>
+              <w:top w:val="single" w:color="BFBFBF" w:sz="6"/>
+              <w:left w:val="single" w:color="BFBFBF" w:sz="6"/>
+              <w:bottom w:val="single" w:color="BFBFBF" w:sz="6"/>
+              <w:right w:val="single" w:color="BFBFBF" w:sz="6"/>
+            </w:tcBorders>
+            <w:shd w:fill="F2F2F2" w:color="auto" w:val="clear"/>
+            <w:tcMar>
+              <w:top w:type="dxa" w:w="100"/>
+              <w:left w:type="dxa" w:w="140"/>
+              <w:bottom w:type="dxa" w:w="100"/>
+              <w:right w:type="dxa" w:w="140"/>
+            </w:tcMar>
+          </w:tcPr>
+          <w:p>
+            <w:pPr>
+              <w:spacing w:after="0"/>
+            </w:pPr>
+            <w:r>
+              <w:rPr>
+                <w:rFonts w:ascii="Consolas" w:cs="Consolas" w:eastAsia="Consolas" w:hAnsi="Consolas"/>
+                <w:sz w:val="18"/>
+                <w:szCs w:val="18"/>
+              </w:rPr>
+              <w:t xml:space="preserve">Show me register item &lt;code&gt;: the legacy cells, what legacy computes, what the module computes and the effect on deciles 1 and 10. Is it a bug or an issue under NORMS.md section 0?</w:t>
+            </w:r>
+          </w:p>
+        </w:tc>
+      </w:tr>
+    </w:tbl>
+    <w:p>
+      <w:pPr>
+        <w:spacing w:after="80"/>
+      </w:pPr>
+    </w:p>
+    <w:p>
+      <w:pPr>
+        <w:spacing w:after="120"/>
+      </w:pPr>
+      <w:r>
+        <w:rPr>
+          <w:rFonts w:ascii="Arial" w:cs="Arial" w:eastAsia="Arial" w:hAnsi="Arial"/>
+          <w:sz w:val="21"/>
+          <w:szCs w:val="21"/>
+        </w:rPr>
+        <w:t xml:space="preserve">Change a distribution setting (the formula source is excel_ai/mitigation/build.py):</w:t>
+      </w:r>
+    </w:p>
+    <w:tbl>
+      <w:tblPr>
+        <w:tblW w:type="dxa" w:w="9360"/>
+        <w:tblBorders>
+          <w:top w:val="single" w:color="auto" w:sz="4"/>
+          <w:left w:val="single" w:color="auto" w:sz="4"/>
+          <w:bottom w:val="single" w:color="auto" w:sz="4"/>
+          <w:right w:val="single" w:color="auto" w:sz="4"/>
+          <w:insideH w:val="single" w:color="auto" w:sz="4"/>
+          <w:insideV w:val="single" w:color="auto" w:sz="4"/>
+        </w:tblBorders>
+      </w:tblPr>
+      <w:tblGrid>
+        <w:gridCol w:w="9360"/>
+      </w:tblGrid>
+      <w:tr>
+        <w:tc>
+          <w:tcPr>
+            <w:tcW w:type="dxa" w:w="9360"/>
+            <w:tcBorders>
+              <w:top w:val="single" w:color="BFBFBF" w:sz="6"/>
+              <w:left w:val="single" w:color="BFBFBF" w:sz="6"/>
+              <w:bottom w:val="single" w:color="BFBFBF" w:sz="6"/>
+              <w:right w:val="single" w:color="BFBFBF" w:sz="6"/>
+            </w:tcBorders>
+            <w:shd w:fill="F2F2F2" w:color="auto" w:val="clear"/>
+            <w:tcMar>
+              <w:top w:type="dxa" w:w="100"/>
+              <w:left w:type="dxa" w:w="140"/>
+              <w:bottom w:type="dxa" w:w="100"/>
+              <w:right w:type="dxa" w:w="140"/>
+            </w:tcMar>
+          </w:tcPr>
+          <w:p>
+            <w:pPr>
+              <w:spacing w:after="0"/>
+            </w:pPr>
+            <w:r>
+              <w:rPr>
+                <w:rFonts w:ascii="Consolas" w:cs="Consolas" w:eastAsia="Consolas" w:hAnsi="Consolas"/>
+                <w:sz w:val="18"/>
+                <w:szCs w:val="18"/>
+              </w:rPr>
+              <w:t xml:space="preserve">&lt;describe the change&gt;. Change it in excel_ai/mitigation/build.py, rebuild the prototype, rebuild the module, run check_distribution.py and show me the result.</w:t>
+            </w:r>
+          </w:p>
+        </w:tc>
+      </w:tr>
+    </w:tbl>
+    <w:p>
+      <w:pPr>
+        <w:spacing w:after="80"/>
+      </w:pPr>
+    </w:p>
+    <w:p>
+      <w:pPr>
+        <w:spacing w:after="120"/>
+      </w:pPr>
+      <w:r>
+        <w:rPr>
+          <w:rFonts w:ascii="Arial" w:cs="Arial" w:eastAsia="Arial" w:hAnsi="Arial"/>
+          <w:sz w:val="21"/>
+          <w:szCs w:val="21"/>
+        </w:rPr>
+        <w:t xml:space="preserve">When a check fails:</w:t>
+      </w:r>
+    </w:p>
+    <w:tbl>
+      <w:tblPr>
+        <w:tblW w:type="dxa" w:w="9360"/>
+        <w:tblBorders>
+          <w:top w:val="single" w:color="auto" w:sz="4"/>
+          <w:left w:val="single" w:color="auto" w:sz="4"/>
+          <w:bottom w:val="single" w:color="auto" w:sz="4"/>
+          <w:right w:val="single" w:color="auto" w:sz="4"/>
+          <w:insideH w:val="single" w:color="auto" w:sz="4"/>
+          <w:insideV w:val="single" w:color="auto" w:sz="4"/>
+        </w:tblBorders>
+      </w:tblPr>
+      <w:tblGrid>
+        <w:gridCol w:w="9360"/>
+      </w:tblGrid>
+      <w:tr>
+        <w:tc>
+          <w:tcPr>
+            <w:tcW w:type="dxa" w:w="9360"/>
+            <w:tcBorders>
+              <w:top w:val="single" w:color="BFBFBF" w:sz="6"/>
+              <w:left w:val="single" w:color="BFBFBF" w:sz="6"/>
+              <w:bottom w:val="single" w:color="BFBFBF" w:sz="6"/>
+              <w:right w:val="single" w:color="BFBFBF" w:sz="6"/>
+            </w:tcBorders>
+            <w:shd w:fill="F2F2F2" w:color="auto" w:val="clear"/>
+            <w:tcMar>
+              <w:top w:type="dxa" w:w="100"/>
+              <w:left w:type="dxa" w:w="140"/>
+              <w:bottom w:type="dxa" w:w="100"/>
+              <w:right w:type="dxa" w:w="140"/>
+            </w:tcMar>
+          </w:tcPr>
+          <w:p>
+            <w:pPr>
+              <w:spacing w:after="0"/>
+            </w:pPr>
+            <w:r>
+              <w:rPr>
+                <w:rFonts w:ascii="Consolas" w:cs="Consolas" w:eastAsia="Consolas" w:hAnsi="Consolas"/>
+                <w:sz w:val="18"/>
+                <w:szCs w:val="18"/>
+              </w:rPr>
+              <w:t xml:space="preserve">check_distribution.py fails on &lt;name of the check&gt;. Find the cause, fix the builder (not the check), rebuild and run the check again. Tell me what was wrong.</w:t>
+            </w:r>
+          </w:p>
+        </w:tc>
+      </w:tr>
+    </w:tbl>
+    <w:p>
+      <w:pPr>
+        <w:spacing w:after="80"/>
+      </w:pPr>
+    </w:p>
+    <w:p>
+      <w:pPr>
+        <w:spacing w:after="120"/>
+      </w:pPr>
+      <w:r>
+        <w:rPr>
+          <w:rFonts w:ascii="Arial" w:cs="Arial" w:eastAsia="Arial" w:hAnsi="Arial"/>
+          <w:sz w:val="21"/>
+          <w:szCs w:val="21"/>
+        </w:rPr>
+        <w:t xml:space="preserve">Before you save:</w:t>
+      </w:r>
+    </w:p>
+    <w:tbl>
+      <w:tblPr>
+        <w:tblW w:type="dxa" w:w="9360"/>
+        <w:tblBorders>
+          <w:top w:val="single" w:color="auto" w:sz="4"/>
+          <w:left w:val="single" w:color="auto" w:sz="4"/>
+          <w:bottom w:val="single" w:color="auto" w:sz="4"/>
+          <w:right w:val="single" w:color="auto" w:sz="4"/>
+          <w:insideH w:val="single" w:color="auto" w:sz="4"/>
+          <w:insideV w:val="single" w:color="auto" w:sz="4"/>
+        </w:tblBorders>
+      </w:tblPr>
+      <w:tblGrid>
+        <w:gridCol w:w="9360"/>
+      </w:tblGrid>
+      <w:tr>
+        <w:tc>
+          <w:tcPr>
+            <w:tcW w:type="dxa" w:w="9360"/>
+            <w:tcBorders>
+              <w:top w:val="single" w:color="BFBFBF" w:sz="6"/>
+              <w:left w:val="single" w:color="BFBFBF" w:sz="6"/>
+              <w:bottom w:val="single" w:color="BFBFBF" w:sz="6"/>
+              <w:right w:val="single" w:color="BFBFBF" w:sz="6"/>
+            </w:tcBorders>
+            <w:shd w:fill="F2F2F2" w:color="auto" w:val="clear"/>
+            <w:tcMar>
+              <w:top w:type="dxa" w:w="100"/>
+              <w:left w:type="dxa" w:w="140"/>
+              <w:bottom w:type="dxa" w:w="100"/>
+              <w:right w:type="dxa" w:w="140"/>
+            </w:tcMar>
+          </w:tcPr>
+          <w:p>
+            <w:pPr>
+              <w:spacing w:after="0"/>
+            </w:pPr>
+            <w:r>
+              <w:rPr>
+                <w:rFonts w:ascii="Consolas" w:cs="Consolas" w:eastAsia="Consolas" w:hAnsi="Consolas"/>
+                <w:sz w:val="18"/>
+                <w:szCs w:val="18"/>
+              </w:rPr>
+              <w:t xml:space="preserve">Show me the changes before you save them. List every file you changed and why.</w:t>
+            </w:r>
+          </w:p>
+        </w:tc>
+      </w:tr>
+    </w:tbl>
+    <w:p>
+      <w:pPr>
+        <w:spacing w:after="80"/>
+      </w:pPr>
+    </w:p>
+    <w:p>
+      <w:pPr>
+        <w:spacing w:after="120"/>
+      </w:pPr>
+      <w:r>
+        <w:rPr>
+          <w:rFonts w:ascii="Arial" w:cs="Arial" w:eastAsia="Arial" w:hAnsi="Arial"/>
+          <w:sz w:val="21"/>
+          <w:szCs w:val="21"/>
+        </w:rPr>
+        <w:t xml:space="preserve">Resume later in a new session:</w:t>
+      </w:r>
+    </w:p>
+    <w:tbl>
+      <w:tblPr>
+        <w:tblW w:type="dxa" w:w="9360"/>
+        <w:tblBorders>
+          <w:top w:val="single" w:color="auto" w:sz="4"/>
+          <w:left w:val="single" w:color="auto" w:sz="4"/>
+          <w:bottom w:val="single" w:color="auto" w:sz="4"/>
+          <w:right w:val="single" w:color="auto" w:sz="4"/>
+          <w:insideH w:val="single" w:color="auto" w:sz="4"/>
+          <w:insideV w:val="single" w:color="auto" w:sz="4"/>
+        </w:tblBorders>
+      </w:tblPr>
+      <w:tblGrid>
+        <w:gridCol w:w="9360"/>
+      </w:tblGrid>
+      <w:tr>
+        <w:tc>
+          <w:tcPr>
+            <w:tcW w:type="dxa" w:w="9360"/>
+            <w:tcBorders>
+              <w:top w:val="single" w:color="BFBFBF" w:sz="6"/>
+              <w:left w:val="single" w:color="BFBFBF" w:sz="6"/>
+              <w:bottom w:val="single" w:color="BFBFBF" w:sz="6"/>
+              <w:right w:val="single" w:color="BFBFBF" w:sz="6"/>
+            </w:tcBorders>
+            <w:shd w:fill="F2F2F2" w:color="auto" w:val="clear"/>
+            <w:tcMar>
+              <w:top w:type="dxa" w:w="100"/>
+              <w:left w:type="dxa" w:w="140"/>
+              <w:bottom w:type="dxa" w:w="100"/>
+              <w:right w:type="dxa" w:w="140"/>
+            </w:tcMar>
+          </w:tcPr>
+          <w:p>
+            <w:pPr>
+              <w:spacing w:after="0"/>
+            </w:pPr>
+            <w:r>
+              <w:rPr>
+                <w:rFonts w:ascii="Consolas" w:cs="Consolas" w:eastAsia="Consolas" w:hAnsi="Consolas"/>
+                <w:sz w:val="18"/>
+                <w:szCs w:val="18"/>
+              </w:rPr>
+              <w:t xml:space="preserve">@AGENTS.md @excel_ai/plans/prompts/Distribution_module_prompt.md We are at phase &lt;n&gt;. Read the bottom of CAVEATS.md and the last report, then do phase &lt;n&gt; only and stop.</w:t>
+            </w:r>
+          </w:p>
+        </w:tc>
+      </w:tr>
+    </w:tbl>
+    <w:p>
+      <w:pPr>
+        <w:spacing w:after="80"/>
+      </w:pPr>
+    </w:p>
+    <w:p>
+      <w:pPr>
+        <w:spacing w:after="120"/>
+      </w:pPr>
+      <w:r>
+        <w:rPr>
+          <w:rFonts w:ascii="Arial" w:cs="Arial" w:eastAsia="Arial" w:hAnsi="Arial"/>
+          <w:sz w:val="21"/>
+          <w:szCs w:val="21"/>
+        </w:rPr>
+        <w:t xml:space="preserve">Then save to GitHub: close the workbooks and double-click </w:t>
+      </w:r>
+      <w:r>
+        <w:rPr>
+          <w:rFonts w:ascii="Consolas" w:cs="Consolas" w:eastAsia="Consolas" w:hAnsi="Consolas"/>
+          <w:sz w:val="19"/>
+          <w:szCs w:val="19"/>
+        </w:rPr>
+        <w:t xml:space="preserve">SyncRepo.bat</w:t>
+      </w:r>
+      <w:r>
+        <w:rPr>
+          <w:rFonts w:ascii="Arial" w:cs="Arial" w:eastAsia="Arial" w:hAnsi="Arial"/>
+          <w:sz w:val="21"/>
+          <w:szCs w:val="21"/>
+        </w:rPr>
+        <w:t xml:space="preserve"> in the repo folder.</w:t>
+      </w:r>
+    </w:p>
     <w:sectPr>
       <w:pgSz w:w="12240" w:h="15840" w:orient="portrait"/>
       <w:pgMar w:top="1440" w:right="1440" w:bottom="1440" w:left="1440" w:header="708" w:footer="708" w:gutter="0"/>

</xml_diff>

<commit_message>
Module prompts: starter queries, Word quick guides written from the starter files
Co-Authored-By: Claude Opus 5.5 <noreply@anthropic.com>
Claude-Session: https://claude.ai/code/session_01VSHkeJ4eFkKsk4vddYXphE
</commit_message>
<xml_diff>
--- a/excel_ai/plans/prompts/CPAT-AI_HowTo_Distribution.docx
+++ b/excel_ai/plans/prompts/CPAT-AI_HowTo_Distribution.docx
@@ -3445,7 +3445,7 @@
           <w:sz w:val="21"/>
           <w:szCs w:val="21"/>
         </w:rPr>
-        <w:t xml:space="preserve"> is not in your checkout yet (the branch is not merged), sync first; if it is still missing, paste the whole of </w:t>
+        <w:t xml:space="preserve"> is not in your checkout, double-click </w:t>
       </w:r>
       <w:r>
         <w:rPr>
@@ -3453,6 +3453,22 @@
           <w:sz w:val="19"/>
           <w:szCs w:val="19"/>
         </w:rPr>
+        <w:t xml:space="preserve">SyncRepo.bat</w:t>
+      </w:r>
+      <w:r>
+        <w:rPr>
+          <w:rFonts w:ascii="Arial" w:cs="Arial" w:eastAsia="Arial" w:hAnsi="Arial"/>
+          <w:sz w:val="21"/>
+          <w:szCs w:val="21"/>
+        </w:rPr>
+        <w:t xml:space="preserve"> first; if it is still missing, paste the whole of </w:t>
+      </w:r>
+      <w:r>
+        <w:rPr>
+          <w:rFonts w:ascii="Consolas" w:cs="Consolas" w:eastAsia="Consolas" w:hAnsi="Consolas"/>
+          <w:sz w:val="19"/>
+          <w:szCs w:val="19"/>
+        </w:rPr>
         <w:t xml:space="preserve">Distribution_module_prompt.md</w:t>
       </w:r>
       <w:r>
@@ -3463,6 +3479,437 @@
         </w:rPr>
         <w:t xml:space="preserve"> instead (Appendix A of the Word guide).</w:t>
       </w:r>
+    </w:p>
+    <w:p>
+      <w:pPr>
+        <w:pStyle w:val="Heading2"/>
+        <w:spacing w:after="100" w:before="200"/>
+      </w:pPr>
+      <w:r>
+        <w:rPr>
+          <w:rFonts w:ascii="Arial" w:cs="Arial" w:eastAsia="Arial" w:hAnsi="Arial"/>
+          <w:b/>
+          <w:bCs/>
+          <w:sz w:val="24"/>
+          <w:szCs w:val="24"/>
+        </w:rPr>
+        <w:t xml:space="preserve">Starter queries</w:t>
+      </w:r>
+    </w:p>
+    <w:p>
+      <w:pPr>
+        <w:spacing w:after="120"/>
+      </w:pPr>
+      <w:r>
+        <w:rPr>
+          <w:rFonts w:ascii="Arial" w:cs="Arial" w:eastAsia="Arial" w:hAnsi="Arial"/>
+          <w:sz w:val="21"/>
+          <w:szCs w:val="21"/>
+        </w:rPr>
+        <w:t xml:space="preserve">One at a time, after the starter (or in a new session with the two files attached):</w:t>
+      </w:r>
+    </w:p>
+    <w:p>
+      <w:pPr>
+        <w:spacing w:after="120"/>
+      </w:pPr>
+      <w:r>
+        <w:rPr>
+          <w:rFonts w:ascii="Arial" w:cs="Arial" w:eastAsia="Arial" w:hAnsi="Arial"/>
+          <w:sz w:val="21"/>
+          <w:szCs w:val="21"/>
+        </w:rPr>
+        <w:t xml:space="preserve">- Review what already exists (the module is built)</w:t>
+      </w:r>
+    </w:p>
+    <w:tbl>
+      <w:tblPr>
+        <w:tblW w:type="dxa" w:w="9360"/>
+        <w:tblBorders>
+          <w:top w:val="single" w:color="auto" w:sz="4"/>
+          <w:left w:val="single" w:color="auto" w:sz="4"/>
+          <w:bottom w:val="single" w:color="auto" w:sz="4"/>
+          <w:right w:val="single" w:color="auto" w:sz="4"/>
+          <w:insideH w:val="single" w:color="auto" w:sz="4"/>
+          <w:insideV w:val="single" w:color="auto" w:sz="4"/>
+        </w:tblBorders>
+      </w:tblPr>
+      <w:tblGrid>
+        <w:gridCol w:w="9360"/>
+      </w:tblGrid>
+      <w:tr>
+        <w:tc>
+          <w:tcPr>
+            <w:tcW w:type="dxa" w:w="9360"/>
+            <w:tcBorders>
+              <w:top w:val="single" w:color="BFBFBF" w:sz="6"/>
+              <w:left w:val="single" w:color="BFBFBF" w:sz="6"/>
+              <w:bottom w:val="single" w:color="BFBFBF" w:sz="6"/>
+              <w:right w:val="single" w:color="BFBFBF" w:sz="6"/>
+            </w:tcBorders>
+            <w:shd w:fill="F2F2F2" w:color="auto" w:val="clear"/>
+            <w:tcMar>
+              <w:top w:type="dxa" w:w="100"/>
+              <w:left w:type="dxa" w:w="140"/>
+              <w:bottom w:type="dxa" w:w="100"/>
+              <w:right w:type="dxa" w:w="140"/>
+            </w:tcMar>
+          </w:tcPr>
+          <w:p>
+            <w:pPr>
+              <w:spacing w:after="0"/>
+            </w:pPr>
+            <w:r>
+              <w:rPr>
+                <w:rFonts w:ascii="Consolas" w:cs="Consolas" w:eastAsia="Consolas" w:hAnsi="Consolas"/>
+                <w:sz w:val="18"/>
+                <w:szCs w:val="18"/>
+              </w:rPr>
+              <w:t xml:space="preserve">@AGENTS.md @excel_ai/plans/prompts/Distribution_module_prompt.md The module exists (v0.1.3). Review it against `NORMS.md` section 9 and its README, run `check_distribution.py`, and report what is missing. Do phase 0 only, then stop and report.</w:t>
+            </w:r>
+          </w:p>
+        </w:tc>
+      </w:tr>
+    </w:tbl>
+    <w:p>
+      <w:pPr>
+        <w:spacing w:after="80"/>
+      </w:pPr>
+    </w:p>
+    <w:p>
+      <w:pPr>
+        <w:spacing w:after="120"/>
+      </w:pPr>
+      <w:r>
+        <w:rPr>
+          <w:rFonts w:ascii="Arial" w:cs="Arial" w:eastAsia="Arial" w:hAnsi="Arial"/>
+          <w:sz w:val="21"/>
+          <w:szCs w:val="21"/>
+        </w:rPr>
+        <w:t xml:space="preserve">- Run a scenario end to end</w:t>
+      </w:r>
+    </w:p>
+    <w:tbl>
+      <w:tblPr>
+        <w:tblW w:type="dxa" w:w="9360"/>
+        <w:tblBorders>
+          <w:top w:val="single" w:color="auto" w:sz="4"/>
+          <w:left w:val="single" w:color="auto" w:sz="4"/>
+          <w:bottom w:val="single" w:color="auto" w:sz="4"/>
+          <w:right w:val="single" w:color="auto" w:sz="4"/>
+          <w:insideH w:val="single" w:color="auto" w:sz="4"/>
+          <w:insideV w:val="single" w:color="auto" w:sz="4"/>
+        </w:tblBorders>
+      </w:tblPr>
+      <w:tblGrid>
+        <w:gridCol w:w="9360"/>
+      </w:tblGrid>
+      <w:tr>
+        <w:tc>
+          <w:tcPr>
+            <w:tcW w:type="dxa" w:w="9360"/>
+            <w:tcBorders>
+              <w:top w:val="single" w:color="BFBFBF" w:sz="6"/>
+              <w:left w:val="single" w:color="BFBFBF" w:sz="6"/>
+              <w:bottom w:val="single" w:color="BFBFBF" w:sz="6"/>
+              <w:right w:val="single" w:color="BFBFBF" w:sz="6"/>
+            </w:tcBorders>
+            <w:shd w:fill="F2F2F2" w:color="auto" w:val="clear"/>
+            <w:tcMar>
+              <w:top w:type="dxa" w:w="100"/>
+              <w:left w:type="dxa" w:w="140"/>
+              <w:bottom w:type="dxa" w:w="100"/>
+              <w:right w:type="dxa" w:w="140"/>
+            </w:tcMar>
+          </w:tcPr>
+          <w:p>
+            <w:pPr>
+              <w:spacing w:after="0"/>
+            </w:pPr>
+            <w:r>
+              <w:rPr>
+                <w:rFonts w:ascii="Consolas" w:cs="Consolas" w:eastAsia="Consolas" w:hAnsi="Consolas"/>
+                <w:sz w:val="18"/>
+                <w:szCs w:val="18"/>
+              </w:rPr>
+              <w:t xml:space="preserve">Change the live carbon price in the mitigation prototype to &lt;x&gt; USD/tCO2 in &lt;year&gt;, update the distribution module from it, and show me the effect by decile and the Gini change against the current values.</w:t>
+            </w:r>
+          </w:p>
+        </w:tc>
+      </w:tr>
+    </w:tbl>
+    <w:p>
+      <w:pPr>
+        <w:spacing w:after="80"/>
+      </w:pPr>
+    </w:p>
+    <w:p>
+      <w:pPr>
+        <w:spacing w:after="120"/>
+      </w:pPr>
+      <w:r>
+        <w:rPr>
+          <w:rFonts w:ascii="Arial" w:cs="Arial" w:eastAsia="Arial" w:hAnsi="Arial"/>
+          <w:sz w:val="21"/>
+          <w:szCs w:val="21"/>
+        </w:rPr>
+        <w:t xml:space="preserve">- Check it against legacy outputs</w:t>
+      </w:r>
+    </w:p>
+    <w:tbl>
+      <w:tblPr>
+        <w:tblW w:type="dxa" w:w="9360"/>
+        <w:tblBorders>
+          <w:top w:val="single" w:color="auto" w:sz="4"/>
+          <w:left w:val="single" w:color="auto" w:sz="4"/>
+          <w:bottom w:val="single" w:color="auto" w:sz="4"/>
+          <w:right w:val="single" w:color="auto" w:sz="4"/>
+          <w:insideH w:val="single" w:color="auto" w:sz="4"/>
+          <w:insideV w:val="single" w:color="auto" w:sz="4"/>
+        </w:tblBorders>
+      </w:tblPr>
+      <w:tblGrid>
+        <w:gridCol w:w="9360"/>
+      </w:tblGrid>
+      <w:tr>
+        <w:tc>
+          <w:tcPr>
+            <w:tcW w:type="dxa" w:w="9360"/>
+            <w:tcBorders>
+              <w:top w:val="single" w:color="BFBFBF" w:sz="6"/>
+              <w:left w:val="single" w:color="BFBFBF" w:sz="6"/>
+              <w:bottom w:val="single" w:color="BFBFBF" w:sz="6"/>
+              <w:right w:val="single" w:color="BFBFBF" w:sz="6"/>
+            </w:tcBorders>
+            <w:shd w:fill="F2F2F2" w:color="auto" w:val="clear"/>
+            <w:tcMar>
+              <w:top w:type="dxa" w:w="100"/>
+              <w:left w:type="dxa" w:w="140"/>
+              <w:bottom w:type="dxa" w:w="100"/>
+              <w:right w:type="dxa" w:w="140"/>
+            </w:tcMar>
+          </w:tcPr>
+          <w:p>
+            <w:pPr>
+              <w:spacing w:after="0"/>
+            </w:pPr>
+            <w:r>
+              <w:rPr>
+                <w:rFonts w:ascii="Consolas" w:cs="Consolas" w:eastAsia="Consolas" w:hAnsi="Consolas"/>
+                <w:sz w:val="18"/>
+                <w:szCs w:val="18"/>
+              </w:rPr>
+              <w:t xml:space="preserve">Check it against legacy outputs: compare the distribution module's results for Egypt with legacy 465's cached values, decile by decile in the analysis year (overall, urban, rural), and the MTOutputs distribution results. List every difference above 0.1% with its cause: a registered bug fix, a replicated issue, or unexplained (then find the cause).</w:t>
+            </w:r>
+          </w:p>
+        </w:tc>
+      </w:tr>
+    </w:tbl>
+    <w:p>
+      <w:pPr>
+        <w:spacing w:after="80"/>
+      </w:pPr>
+    </w:p>
+    <w:p>
+      <w:pPr>
+        <w:spacing w:after="120"/>
+      </w:pPr>
+      <w:r>
+        <w:rPr>
+          <w:rFonts w:ascii="Arial" w:cs="Arial" w:eastAsia="Arial" w:hAnsi="Arial"/>
+          <w:sz w:val="21"/>
+          <w:szCs w:val="21"/>
+        </w:rPr>
+        <w:t xml:space="preserve">- Produce a short PowerPoint, following the norms of the other documents</w:t>
+      </w:r>
+    </w:p>
+    <w:tbl>
+      <w:tblPr>
+        <w:tblW w:type="dxa" w:w="9360"/>
+        <w:tblBorders>
+          <w:top w:val="single" w:color="auto" w:sz="4"/>
+          <w:left w:val="single" w:color="auto" w:sz="4"/>
+          <w:bottom w:val="single" w:color="auto" w:sz="4"/>
+          <w:right w:val="single" w:color="auto" w:sz="4"/>
+          <w:insideH w:val="single" w:color="auto" w:sz="4"/>
+          <w:insideV w:val="single" w:color="auto" w:sz="4"/>
+        </w:tblBorders>
+      </w:tblPr>
+      <w:tblGrid>
+        <w:gridCol w:w="9360"/>
+      </w:tblGrid>
+      <w:tr>
+        <w:tc>
+          <w:tcPr>
+            <w:tcW w:type="dxa" w:w="9360"/>
+            <w:tcBorders>
+              <w:top w:val="single" w:color="BFBFBF" w:sz="6"/>
+              <w:left w:val="single" w:color="BFBFBF" w:sz="6"/>
+              <w:bottom w:val="single" w:color="BFBFBF" w:sz="6"/>
+              <w:right w:val="single" w:color="BFBFBF" w:sz="6"/>
+            </w:tcBorders>
+            <w:shd w:fill="F2F2F2" w:color="auto" w:val="clear"/>
+            <w:tcMar>
+              <w:top w:type="dxa" w:w="100"/>
+              <w:left w:type="dxa" w:w="140"/>
+              <w:bottom w:type="dxa" w:w="100"/>
+              <w:right w:type="dxa" w:w="140"/>
+            </w:tcMar>
+          </w:tcPr>
+          <w:p>
+            <w:pPr>
+              <w:spacing w:after="0"/>
+            </w:pPr>
+            <w:r>
+              <w:rPr>
+                <w:rFonts w:ascii="Consolas" w:cs="Consolas" w:eastAsia="Consolas" w:hAnsi="Consolas"/>
+                <w:sz w:val="18"/>
+                <w:szCs w:val="18"/>
+              </w:rPr>
+              <w:t xml:space="preserve">Produce a short PowerPoint (about 6 slides) on the distribution module: what it does, how it links to the other modules, the results for Egypt against legacy, the bugs fixed and issues replicated (codes), open decisions. Follow the norms of the other documents: the CPAT-AI Overview deck (`excel_ai/CPAT-AI_Overview_v&lt;version&gt;.pptx`, builder `excel_ai/mitigation/presentation/build_deck.js`), counts taken from the register, `NORMS.md` 5. Save it as `excel_ai/CPAT-AI_Distribution_Overview_v&lt;version&gt;.pptx`.</w:t>
+            </w:r>
+          </w:p>
+        </w:tc>
+      </w:tr>
+    </w:tbl>
+    <w:p>
+      <w:pPr>
+        <w:spacing w:after="80"/>
+      </w:pPr>
+    </w:p>
+    <w:p>
+      <w:pPr>
+        <w:spacing w:after="120"/>
+      </w:pPr>
+      <w:r>
+        <w:rPr>
+          <w:rFonts w:ascii="Arial" w:cs="Arial" w:eastAsia="Arial" w:hAnsi="Arial"/>
+          <w:sz w:val="21"/>
+          <w:szCs w:val="21"/>
+        </w:rPr>
+        <w:t xml:space="preserve">- Check that every bug found is in the registers</w:t>
+      </w:r>
+    </w:p>
+    <w:tbl>
+      <w:tblPr>
+        <w:tblW w:type="dxa" w:w="9360"/>
+        <w:tblBorders>
+          <w:top w:val="single" w:color="auto" w:sz="4"/>
+          <w:left w:val="single" w:color="auto" w:sz="4"/>
+          <w:bottom w:val="single" w:color="auto" w:sz="4"/>
+          <w:right w:val="single" w:color="auto" w:sz="4"/>
+          <w:insideH w:val="single" w:color="auto" w:sz="4"/>
+          <w:insideV w:val="single" w:color="auto" w:sz="4"/>
+        </w:tblBorders>
+      </w:tblPr>
+      <w:tblGrid>
+        <w:gridCol w:w="9360"/>
+      </w:tblGrid>
+      <w:tr>
+        <w:tc>
+          <w:tcPr>
+            <w:tcW w:type="dxa" w:w="9360"/>
+            <w:tcBorders>
+              <w:top w:val="single" w:color="BFBFBF" w:sz="6"/>
+              <w:left w:val="single" w:color="BFBFBF" w:sz="6"/>
+              <w:bottom w:val="single" w:color="BFBFBF" w:sz="6"/>
+              <w:right w:val="single" w:color="BFBFBF" w:sz="6"/>
+            </w:tcBorders>
+            <w:shd w:fill="F2F2F2" w:color="auto" w:val="clear"/>
+            <w:tcMar>
+              <w:top w:type="dxa" w:w="100"/>
+              <w:left w:type="dxa" w:w="140"/>
+              <w:bottom w:type="dxa" w:w="100"/>
+              <w:right w:type="dxa" w:w="140"/>
+            </w:tcMar>
+          </w:tcPr>
+          <w:p>
+            <w:pPr>
+              <w:spacing w:after="0"/>
+            </w:pPr>
+            <w:r>
+              <w:rPr>
+                <w:rFonts w:ascii="Consolas" w:cs="Consolas" w:eastAsia="Consolas" w:hAnsi="Consolas"/>
+                <w:sz w:val="18"/>
+                <w:szCs w:val="18"/>
+              </w:rPr>
+              <w:t xml:space="preserve">Check that every bug and issue you found is in the register (`excel_ai/mitigation/issues_register.py`, `make_legacy_fixes.py`), with its code, legacy cells and cross-references; regenerate `excel_ai/BUGS.md`, `excel_ai/ISSUES.md` and the tracker, and list what you added.</w:t>
+            </w:r>
+          </w:p>
+        </w:tc>
+      </w:tr>
+    </w:tbl>
+    <w:p>
+      <w:pPr>
+        <w:spacing w:after="80"/>
+      </w:pPr>
+    </w:p>
+    <w:p>
+      <w:pPr>
+        <w:spacing w:after="120"/>
+      </w:pPr>
+      <w:r>
+        <w:rPr>
+          <w:rFonts w:ascii="Arial" w:cs="Arial" w:eastAsia="Arial" w:hAnsi="Arial"/>
+          <w:sz w:val="21"/>
+          <w:szCs w:val="21"/>
+        </w:rPr>
+        <w:t xml:space="preserve">- Adjust what you do not like or what is missing</w:t>
+      </w:r>
+    </w:p>
+    <w:tbl>
+      <w:tblPr>
+        <w:tblW w:type="dxa" w:w="9360"/>
+        <w:tblBorders>
+          <w:top w:val="single" w:color="auto" w:sz="4"/>
+          <w:left w:val="single" w:color="auto" w:sz="4"/>
+          <w:bottom w:val="single" w:color="auto" w:sz="4"/>
+          <w:right w:val="single" w:color="auto" w:sz="4"/>
+          <w:insideH w:val="single" w:color="auto" w:sz="4"/>
+          <w:insideV w:val="single" w:color="auto" w:sz="4"/>
+        </w:tblBorders>
+      </w:tblPr>
+      <w:tblGrid>
+        <w:gridCol w:w="9360"/>
+      </w:tblGrid>
+      <w:tr>
+        <w:tc>
+          <w:tcPr>
+            <w:tcW w:type="dxa" w:w="9360"/>
+            <w:tcBorders>
+              <w:top w:val="single" w:color="BFBFBF" w:sz="6"/>
+              <w:left w:val="single" w:color="BFBFBF" w:sz="6"/>
+              <w:bottom w:val="single" w:color="BFBFBF" w:sz="6"/>
+              <w:right w:val="single" w:color="BFBFBF" w:sz="6"/>
+            </w:tcBorders>
+            <w:shd w:fill="F2F2F2" w:color="auto" w:val="clear"/>
+            <w:tcMar>
+              <w:top w:type="dxa" w:w="100"/>
+              <w:left w:type="dxa" w:w="140"/>
+              <w:bottom w:type="dxa" w:w="100"/>
+              <w:right w:type="dxa" w:w="140"/>
+            </w:tcMar>
+          </w:tcPr>
+          <w:p>
+            <w:pPr>
+              <w:spacing w:after="0"/>
+            </w:pPr>
+            <w:r>
+              <w:rPr>
+                <w:rFonts w:ascii="Consolas" w:cs="Consolas" w:eastAsia="Consolas" w:hAnsi="Consolas"/>
+                <w:sz w:val="18"/>
+                <w:szCs w:val="18"/>
+              </w:rPr>
+              <w:t xml:space="preserve">I found I don't like format (x) / you are lacking output (y): please adjust. Change the builder, not the built workbook; rebuild, rerun the check and show me the result.</w:t>
+            </w:r>
+          </w:p>
+        </w:tc>
+      </w:tr>
+    </w:tbl>
+    <w:p>
+      <w:pPr>
+        <w:spacing w:after="80"/>
+      </w:pPr>
     </w:p>
     <w:p>
       <w:pPr>

</xml_diff>